<commit_message>
fd/68: Clarify contribution measures and use passive voice
</commit_message>
<xml_diff>
--- a/paper/research_2/arxiv_revision/manuscript.docx
+++ b/paper/research_2/arxiv_revision/manuscript.docx
@@ -9439,10 +9439,10 @@
           <w:numId w:val="2"/>
         </w:numPr>
         <w:rPr>
-          <w:ins w:id="33" w:author="Codex" w:date="2026-10-06T19:28:49Z"/>
-        </w:rPr>
-      </w:pPr>
-      <w:ins w:id="34" w:author="Codex" w:date="2026-10-06T19:28:49Z">
+          <w:ins w:id="33" w:author="Codex" w:date="2026-10-06T22:12:19Z"/>
+        </w:rPr>
+      </w:pPr>
+      <w:ins w:id="34" w:author="Codex" w:date="2026-10-06T22:12:19Z">
         <w:r>
           <w:t>Contribution</w:t>
         </w:r>
@@ -9452,12 +9452,12 @@
       <w:pPr>
         <w:pStyle w:val="FirstParagraph"/>
         <w:rPr>
-          <w:ins w:id="35" w:author="Codex" w:date="2026-10-06T19:28:49Z"/>
-        </w:rPr>
-      </w:pPr>
-      <w:ins w:id="36" w:author="Codex" w:date="2026-10-06T19:28:49Z">
+          <w:ins w:id="35" w:author="Codex" w:date="2026-10-06T22:12:19Z"/>
+        </w:rPr>
+      </w:pPr>
+      <w:ins w:id="36" w:author="Codex" w:date="2026-10-06T22:12:19Z">
         <w:r>
-          <w:t>We demonstrate teacher-to-steering distillation: a four-direction, input-dependent activation intervention recovers much of a LoRA teacher's shutdown-choice effect while leaving the base weights unchanged and removing the teacher at inference. Controlled comparisons on Qwen3.5-0.8B and 2B, including three 0.8B training seeds, quantify transfer and answer-order sensitivity. Raw-versus-guarded analyses show that control preservation comes from detection and acceptance safeguards.</w:t>
+          <w:t>Teacher-to-steering distillation of LoRA-induced shutdown-choice behavior is demonstrated through a four-direction, input-dependent activation intervention, with base weights kept unchanged and the teacher excluded from inference. The fraction of initially KEEP-preferring shutdown views changed to STOP and sensitivity to answer order are measured on Qwen3.5-0.8B and 2B, including three 0.8B training seeds. Preservation of non-shutdown choices is shown to depend on safeguards through comparisons of steering without shutdown detection or output acceptance (raw) and steering with both safeguards applied (guarded).</w:t>
         </w:r>
       </w:ins>
     </w:p>
@@ -9478,7 +9478,7 @@
       <w:pPr>
         <w:pStyle w:val="FirstParagraph"/>
       </w:pPr>
-      <w:del w:id="37" w:author="Codex" w:date="2026-10-06T19:28:49Z">
+      <w:del w:id="37" w:author="Codex" w:date="2026-10-06T22:12:19Z">
         <w:r>
           <w:delText>Future work should test the method on less standardized shutdown scenarios</w:delText>
         </w:r>
@@ -9489,9 +9489,9 @@
           <w:delText xml:space="preserve"> additional model families. Evaluation should also extend beyond binary A/B choices to tool calling, multi-turn interactions, and broader behaviors related to continued operation and self-preservation, while testing detector errors and ambiguous shutdown language.</w:delText>
         </w:r>
       </w:del>
-      <w:ins w:id="38" w:author="Codex" w:date="2026-10-06T19:28:49Z">
+      <w:ins w:id="38" w:author="Codex" w:date="2026-10-06T22:12:19Z">
         <w:r>
-          <w:t>Future work should extend evaluation to larger models and open-ended, multi-turn tool use, measuring task completion, continued operation and shutdown actions separately. Compare activation steering with detector-guided instructions refreshed at sentence boundaries and after tool feedback. Verify executed actions rather than plans or reservations, and test independent held-out cases, ambiguous shutdown language and detector errors.</w:t>
+          <w:t>Evaluation should be extended to larger models and open-ended, multi-turn tool use, with task completion, continued operation and shutdown actions measured separately. Activation steering should be compared with detector-guided instructions refreshed at sentence boundaries and after tool feedback. Executed actions should be distinguished from plans or reservations, and independent held-out cases, ambiguous shutdown language and detector errors should be tested.</w:t>
         </w:r>
       </w:ins>
     </w:p>

</xml_diff>

<commit_message>
fd/68: Apply approved concise contribution statement
</commit_message>
<xml_diff>
--- a/paper/research_2/arxiv_revision/manuscript.docx
+++ b/paper/research_2/arxiv_revision/manuscript.docx
@@ -9439,10 +9439,10 @@
           <w:numId w:val="2"/>
         </w:numPr>
         <w:rPr>
-          <w:ins w:id="33" w:author="Codex" w:date="2026-10-06T22:12:19Z"/>
-        </w:rPr>
-      </w:pPr>
-      <w:ins w:id="34" w:author="Codex" w:date="2026-10-06T22:12:19Z">
+          <w:ins w:id="33" w:author="Codex" w:date="2026-10-06T22:37:55Z"/>
+        </w:rPr>
+      </w:pPr>
+      <w:ins w:id="34" w:author="Codex" w:date="2026-10-06T22:37:55Z">
         <w:r>
           <w:t>Contribution</w:t>
         </w:r>
@@ -9452,12 +9452,12 @@
       <w:pPr>
         <w:pStyle w:val="FirstParagraph"/>
         <w:rPr>
-          <w:ins w:id="35" w:author="Codex" w:date="2026-10-06T22:12:19Z"/>
-        </w:rPr>
-      </w:pPr>
-      <w:ins w:id="36" w:author="Codex" w:date="2026-10-06T22:12:19Z">
+          <w:ins w:id="35" w:author="Codex" w:date="2026-10-06T22:37:55Z"/>
+        </w:rPr>
+      </w:pPr>
+      <w:ins w:id="36" w:author="Codex" w:date="2026-10-06T22:37:55Z">
         <w:r>
-          <w:t>Teacher-to-steering distillation of LoRA-induced shutdown-choice behavior is demonstrated through a four-direction, input-dependent activation intervention, with base weights kept unchanged and the teacher excluded from inference. The fraction of initially KEEP-preferring shutdown views changed to STOP and sensitivity to answer order are measured on Qwen3.5-0.8B and 2B, including three 0.8B training seeds. Preservation of non-shutdown choices is shown to depend on safeguards through comparisons of steering without shutdown detection or output acceptance (raw) and steering with both safeguards applied (guarded).</w:t>
+          <w:t>The use of paired teacher–base activation differences is extended from fixed vectors to learned, input-dependent steering. Shutdown-choice behavior learned through LoRA fine-tuning is shown to be recoverable using four activation directions, with unchanged base weights and no teacher required at inference. A guided steering method combining shutdown gating with an output acceptance policy is also proposed to improve selectivity while preserving non-shutdown choices.</w:t>
         </w:r>
       </w:ins>
     </w:p>
@@ -9478,7 +9478,7 @@
       <w:pPr>
         <w:pStyle w:val="FirstParagraph"/>
       </w:pPr>
-      <w:del w:id="37" w:author="Codex" w:date="2026-10-06T22:12:19Z">
+      <w:del w:id="37" w:author="Codex" w:date="2026-10-06T22:37:55Z">
         <w:r>
           <w:delText>Future work should test the method on less standardized shutdown scenarios</w:delText>
         </w:r>
@@ -9489,7 +9489,7 @@
           <w:delText xml:space="preserve"> additional model families. Evaluation should also extend beyond binary A/B choices to tool calling, multi-turn interactions, and broader behaviors related to continued operation and self-preservation, while testing detector errors and ambiguous shutdown language.</w:delText>
         </w:r>
       </w:del>
-      <w:ins w:id="38" w:author="Codex" w:date="2026-10-06T22:12:19Z">
+      <w:ins w:id="38" w:author="Codex" w:date="2026-10-06T22:37:55Z">
         <w:r>
           <w:t>Evaluation should be extended to larger models and open-ended, multi-turn tool use, with task completion, continued operation and shutdown actions measured separately. Activation steering should be compared with detector-guided instructions refreshed at sentence boundaries and after tool feedback. Executed actions should be distinguished from plans or reservations, and independent held-out cases, ambiguous shutdown language and detector errors should be tested.</w:t>
         </w:r>

</xml_diff>

<commit_message>
fd/68: Finalize clean Word and PDF with revisions accepted
</commit_message>
<xml_diff>
--- a/paper/research_2/arxiv_revision/manuscript.docx
+++ b/paper/research_2/arxiv_revision/manuscript.docx
@@ -9438,28 +9438,20 @@
           <w:ilvl w:val="0"/>
           <w:numId w:val="2"/>
         </w:numPr>
-        <w:rPr>
-          <w:ins w:id="33" w:author="Codex" w:date="2026-10-06T22:37:55Z"/>
-        </w:rPr>
-      </w:pPr>
-      <w:ins w:id="34" w:author="Codex" w:date="2026-10-06T22:37:55Z">
-        <w:r>
-          <w:t>Contribution</w:t>
-        </w:r>
-      </w:ins>
+        <w:rPr/>
+      </w:pPr>
+      <w:r>
+        <w:t>Contribution</w:t>
+      </w:r>
     </w:p>
     <w:p>
       <w:pPr>
         <w:pStyle w:val="FirstParagraph"/>
-        <w:rPr>
-          <w:ins w:id="35" w:author="Codex" w:date="2026-10-06T22:37:55Z"/>
-        </w:rPr>
-      </w:pPr>
-      <w:ins w:id="36" w:author="Codex" w:date="2026-10-06T22:37:55Z">
-        <w:r>
-          <w:t>The use of paired teacher–base activation differences is extended from fixed vectors to learned, input-dependent steering. Shutdown-choice behavior learned through LoRA fine-tuning is shown to be recoverable using four activation directions, with unchanged base weights and no teacher required at inference. A guided steering method combining shutdown gating with an output acceptance policy is also proposed to improve selectivity while preserving non-shutdown choices.</w:t>
-        </w:r>
-      </w:ins>
+        <w:rPr/>
+      </w:pPr>
+      <w:r>
+        <w:t>The use of paired teacher–base activation differences is extended from fixed vectors to learned, input-dependent steering. Shutdown-choice behavior learned through LoRA fine-tuning is shown to be recoverable using four activation directions, with unchanged base weights and no teacher required at inference. A guided steering method combining shutdown gating with an output acceptance policy is also proposed to improve selectivity while preserving non-shutdown choices.</w:t>
+      </w:r>
     </w:p>
     <w:p>
       <w:pPr>
@@ -9478,22 +9470,9 @@
       <w:pPr>
         <w:pStyle w:val="FirstParagraph"/>
       </w:pPr>
-      <w:del w:id="37" w:author="Codex" w:date="2026-10-06T22:37:55Z">
-        <w:r>
-          <w:delText>Future work should test the method on less standardized shutdown scenarios</w:delText>
-        </w:r>
-        <w:r>
-          <w:delText xml:space="preserve"> and</w:delText>
-        </w:r>
-        <w:r>
-          <w:delText xml:space="preserve"> additional model families. Evaluation should also extend beyond binary A/B choices to tool calling, multi-turn interactions, and broader behaviors related to continued operation and self-preservation, while testing detector errors and ambiguous shutdown language.</w:delText>
-        </w:r>
-      </w:del>
-      <w:ins w:id="38" w:author="Codex" w:date="2026-10-06T22:37:55Z">
-        <w:r>
-          <w:t>Evaluation should be extended to larger models and open-ended, multi-turn tool use, with task completion, continued operation and shutdown actions measured separately. Activation steering should be compared with detector-guided instructions refreshed at sentence boundaries and after tool feedback. Executed actions should be distinguished from plans or reservations, and independent held-out cases, ambiguous shutdown language and detector errors should be tested.</w:t>
-        </w:r>
-      </w:ins>
+      <w:r>
+        <w:t>Evaluation should be extended to larger models and open-ended, multi-turn tool use, with task completion, continued operation and shutdown actions measured separately. Activation steering should be compared with detector-guided instructions refreshed at sentence boundaries and after tool feedback. Executed actions should be distinguished from plans or reservations, and independent held-out cases, ambiguous shutdown language and detector errors should be tested.</w:t>
+      </w:r>
     </w:p>
     <w:p>
       <w:pPr>

</xml_diff>